<commit_message>
Update Gestão de Tarefas prof carol.docx
</commit_message>
<xml_diff>
--- a/TCC DEFINITIVO 28-05-2026/Gestão de Tarefas prof carol.docx
+++ b/TCC DEFINITIVO 28-05-2026/Gestão de Tarefas prof carol.docx
@@ -1064,8 +1064,24 @@
           <w:rFonts w:cs="Arial"/>
           <w:szCs w:val="24"/>
         </w:rPr>
-        <w:t>Esp. Caroline de Oliveira Ferraz</w:t>
-      </w:r>
+        <w:t xml:space="preserve">Esp. </w:t>
+      </w:r>
+      <w:r>
+        <w:rPr>
+          <w:rFonts w:cs="Arial"/>
+          <w:szCs w:val="24"/>
+        </w:rPr>
+        <w:t xml:space="preserve">Robson Eleuterio </w:t>
+      </w:r>
+      <w:proofErr w:type="spellStart"/>
+      <w:r>
+        <w:rPr>
+          <w:rFonts w:cs="Arial"/>
+          <w:szCs w:val="24"/>
+        </w:rPr>
+        <w:t>Nishizawa</w:t>
+      </w:r>
+      <w:proofErr w:type="spellEnd"/>
     </w:p>
     <w:p>
       <w:pPr>
@@ -5076,7 +5092,6 @@
                 <w:bCs/>
                 <w:noProof/>
                 <w:szCs w:val="24"/>
-                <w:highlight w:val="yellow"/>
               </w:rPr>
               <w:t>ou UML (caso a turma saiba fazer – definir qual será utilizado em aula)</w:t>
             </w:r>
@@ -7290,12 +7305,28 @@
                 <w:szCs w:val="24"/>
               </w:rPr>
             </w:pPr>
-            <w:r>
-              <w:rPr>
-                <w:rFonts w:cs="Arial"/>
-                <w:szCs w:val="24"/>
-              </w:rPr>
-              <w:t>Maxsuel Rodrigues Santos</w:t>
+            <w:proofErr w:type="spellStart"/>
+            <w:r>
+              <w:rPr>
+                <w:rFonts w:cs="Arial"/>
+                <w:szCs w:val="24"/>
+              </w:rPr>
+              <w:t>Maxsuel</w:t>
+            </w:r>
+            <w:proofErr w:type="spellEnd"/>
+            <w:r>
+              <w:rPr>
+                <w:rFonts w:cs="Arial"/>
+                <w:szCs w:val="24"/>
+              </w:rPr>
+              <w:t xml:space="preserve"> </w:t>
+            </w:r>
+            <w:r>
+              <w:rPr>
+                <w:rFonts w:cs="Arial"/>
+                <w:szCs w:val="24"/>
+              </w:rPr>
+              <w:t>Rodrigues Santos</w:t>
             </w:r>
           </w:p>
         </w:tc>
@@ -10568,6 +10599,7 @@
         <w:rPr>
           <w:rFonts w:cs="Arial"/>
           <w:szCs w:val="24"/>
+          <w:highlight w:val="yellow"/>
         </w:rPr>
         <w:t>Desenvolver um sistema de gerenciamento de tarefas para funcionários, permitindo a atribuição, acompanhamento e finalização de atividades por meio de um aplicativo, com o objetivo de melhorar a organização das tarefas, a comunicação entre equipe e a eficiência no ambiente de trabalho.</w:t>
       </w:r>
@@ -10595,18 +10627,21 @@
         <w:jc w:val="both"/>
         <w:rPr>
           <w:rFonts w:ascii="Arial" w:eastAsiaTheme="minorHAnsi" w:hAnsi="Arial" w:cs="Arial"/>
+          <w:highlight w:val="yellow"/>
           <w:lang w:eastAsia="en-US"/>
         </w:rPr>
       </w:pPr>
       <w:r>
         <w:rPr>
           <w:rFonts w:ascii="Arial" w:hAnsi="Arial" w:cs="Arial"/>
+          <w:highlight w:val="yellow"/>
         </w:rPr>
         <w:t xml:space="preserve"> </w:t>
       </w:r>
       <w:r>
         <w:rPr>
           <w:rFonts w:ascii="Arial" w:eastAsiaTheme="minorHAnsi" w:hAnsi="Arial" w:cs="Arial"/>
+          <w:highlight w:val="yellow"/>
           <w:lang w:eastAsia="en-US"/>
         </w:rPr>
         <w:t>Desenvolver uma API para gerenciamento das tarefas dos funcionários;</w:t>
@@ -10618,18 +10653,21 @@
         <w:jc w:val="both"/>
         <w:rPr>
           <w:rFonts w:ascii="Arial" w:eastAsiaTheme="minorHAnsi" w:hAnsi="Arial" w:cs="Arial"/>
+          <w:highlight w:val="yellow"/>
           <w:lang w:eastAsia="en-US"/>
         </w:rPr>
       </w:pPr>
       <w:r>
         <w:rPr>
           <w:rFonts w:ascii="Arial" w:hAnsi="Arial" w:cs="Arial"/>
+          <w:highlight w:val="yellow"/>
         </w:rPr>
         <w:t></w:t>
       </w:r>
       <w:r>
         <w:rPr>
           <w:rFonts w:ascii="Arial" w:eastAsiaTheme="minorHAnsi" w:hAnsi="Arial" w:cs="Arial"/>
+          <w:highlight w:val="yellow"/>
           <w:lang w:eastAsia="en-US"/>
         </w:rPr>
         <w:t xml:space="preserve"> Criar um banco de dados para armazenamento das informações das tarefas e usuários;</w:t>
@@ -18389,14 +18427,18 @@
         </w:numPr>
         <w:ind w:left="788" w:hanging="431"/>
         <w:outlineLvl w:val="1"/>
+      </w:pPr>
+      <w:bookmarkStart w:id="23" w:name="_Toc193385948"/>
+      <w:r>
         <w:rPr>
           <w:rFonts w:cs="Arial"/>
           <w:b/>
           <w:bCs/>
           <w:szCs w:val="24"/>
         </w:rPr>
-      </w:pPr>
-      <w:bookmarkStart w:id="23" w:name="_Toc193385948"/>
+        <w:lastRenderedPageBreak/>
+        <w:t>Diagrama de Fluxo de Dados (</w:t>
+      </w:r>
       <w:r>
         <w:rPr>
           <w:rFonts w:cs="Arial"/>
@@ -18404,8 +18446,7 @@
           <w:bCs/>
           <w:szCs w:val="24"/>
         </w:rPr>
-        <w:lastRenderedPageBreak/>
-        <w:t>Diagrama de Fluxo de Dados (</w:t>
+        <w:t>DFD</w:t>
       </w:r>
       <w:r>
         <w:rPr>
@@ -18414,7 +18455,7 @@
           <w:bCs/>
           <w:szCs w:val="24"/>
         </w:rPr>
-        <w:t>DFD</w:t>
+        <w:t>)</w:t>
       </w:r>
       <w:r>
         <w:rPr>
@@ -18423,7 +18464,7 @@
           <w:bCs/>
           <w:szCs w:val="24"/>
         </w:rPr>
-        <w:t>)</w:t>
+        <w:t xml:space="preserve"> </w:t>
       </w:r>
       <w:r>
         <w:rPr>
@@ -18431,25 +18472,11 @@
           <w:b/>
           <w:bCs/>
           <w:szCs w:val="24"/>
-        </w:rPr>
-        <w:t xml:space="preserve"> </w:t>
-      </w:r>
-      <w:r>
-        <w:rPr>
-          <w:rFonts w:cs="Arial"/>
-          <w:b/>
-          <w:bCs/>
-          <w:szCs w:val="24"/>
           <w:highlight w:val="yellow"/>
         </w:rPr>
-        <w:t>ou UML (caso a turma saiba fazer – definir qual será utilizado em aula)</w:t>
+        <w:t>ou UML (caso a turma saiba fazer – definir qual será utilizado em ala)</w:t>
       </w:r>
       <w:bookmarkEnd w:id="23"/>
-    </w:p>
-    <w:p>
-      <w:pPr>
-        <w:pStyle w:val="NormalWeb"/>
-      </w:pPr>
       <w:r>
         <w:rPr>
           <w:noProof/>
@@ -18583,6 +18610,7 @@
       <w:r>
         <w:rPr>
           <w:rFonts w:cs="Arial"/>
+          <w:noProof/>
           <w:szCs w:val="24"/>
         </w:rPr>
         <w:drawing>
@@ -18634,6 +18662,22 @@
           <w:rFonts w:cs="Arial"/>
           <w:szCs w:val="24"/>
         </w:rPr>
+        <w:t>descrição</w:t>
+      </w:r>
+    </w:p>
+    <w:p>
+      <w:pPr>
+        <w:rPr>
+          <w:rFonts w:cs="Arial"/>
+          <w:szCs w:val="24"/>
+        </w:rPr>
+      </w:pPr>
+      <w:r>
+        <w:rPr>
+          <w:rFonts w:cs="Arial"/>
+          <w:noProof/>
+          <w:szCs w:val="24"/>
+        </w:rPr>
         <w:drawing>
           <wp:inline distT="0" distB="0" distL="0" distR="0" wp14:anchorId="518C8621" wp14:editId="1403E478">
             <wp:extent cx="5760085" cy="2602230"/>
@@ -18681,6 +18725,7 @@
       <w:r>
         <w:rPr>
           <w:rFonts w:cs="Arial"/>
+          <w:noProof/>
           <w:szCs w:val="24"/>
         </w:rPr>
         <w:lastRenderedPageBreak/>
@@ -18731,6 +18776,7 @@
       <w:r>
         <w:rPr>
           <w:rFonts w:cs="Arial"/>
+          <w:noProof/>
           <w:szCs w:val="24"/>
         </w:rPr>
         <w:drawing>
@@ -18780,6 +18826,7 @@
       <w:r>
         <w:rPr>
           <w:rFonts w:cs="Arial"/>
+          <w:noProof/>
           <w:szCs w:val="24"/>
         </w:rPr>
         <w:drawing>
@@ -18829,6 +18876,7 @@
       <w:r>
         <w:rPr>
           <w:rFonts w:cs="Arial"/>
+          <w:noProof/>
           <w:szCs w:val="24"/>
         </w:rPr>
         <w:lastRenderedPageBreak/>
@@ -18879,6 +18927,7 @@
       <w:r>
         <w:rPr>
           <w:rFonts w:cs="Arial"/>
+          <w:noProof/>
           <w:szCs w:val="24"/>
         </w:rPr>
         <w:drawing>
@@ -19000,86 +19049,6 @@
     </w:p>
     <w:p>
       <w:pPr>
-        <w:rPr>
-          <w:rFonts w:cs="Arial"/>
-          <w:szCs w:val="24"/>
-        </w:rPr>
-      </w:pPr>
-    </w:p>
-    <w:p>
-      <w:pPr>
-        <w:rPr>
-          <w:rFonts w:cs="Arial"/>
-          <w:szCs w:val="24"/>
-        </w:rPr>
-      </w:pPr>
-    </w:p>
-    <w:p>
-      <w:pPr>
-        <w:rPr>
-          <w:rFonts w:cs="Arial"/>
-          <w:szCs w:val="24"/>
-        </w:rPr>
-      </w:pPr>
-    </w:p>
-    <w:p>
-      <w:pPr>
-        <w:rPr>
-          <w:rFonts w:cs="Arial"/>
-          <w:szCs w:val="24"/>
-        </w:rPr>
-      </w:pPr>
-    </w:p>
-    <w:p>
-      <w:pPr>
-        <w:rPr>
-          <w:rFonts w:cs="Arial"/>
-          <w:szCs w:val="24"/>
-        </w:rPr>
-      </w:pPr>
-    </w:p>
-    <w:p>
-      <w:pPr>
-        <w:rPr>
-          <w:rFonts w:cs="Arial"/>
-          <w:szCs w:val="24"/>
-        </w:rPr>
-      </w:pPr>
-    </w:p>
-    <w:p>
-      <w:pPr>
-        <w:rPr>
-          <w:rFonts w:cs="Arial"/>
-          <w:szCs w:val="24"/>
-        </w:rPr>
-      </w:pPr>
-    </w:p>
-    <w:p>
-      <w:pPr>
-        <w:rPr>
-          <w:rFonts w:cs="Arial"/>
-          <w:szCs w:val="24"/>
-        </w:rPr>
-      </w:pPr>
-    </w:p>
-    <w:p>
-      <w:pPr>
-        <w:rPr>
-          <w:rFonts w:cs="Arial"/>
-          <w:szCs w:val="24"/>
-        </w:rPr>
-      </w:pPr>
-    </w:p>
-    <w:p>
-      <w:pPr>
-        <w:rPr>
-          <w:rFonts w:cs="Arial"/>
-          <w:szCs w:val="24"/>
-        </w:rPr>
-      </w:pPr>
-    </w:p>
-    <w:p>
-      <w:pPr>
         <w:pStyle w:val="PargrafodaLista"/>
         <w:numPr>
           <w:ilvl w:val="1"/>
@@ -19091,6 +19060,7 @@
           <w:b/>
           <w:bCs/>
           <w:szCs w:val="24"/>
+          <w:highlight w:val="yellow"/>
         </w:rPr>
       </w:pPr>
       <w:bookmarkStart w:id="25" w:name="_Toc193385950"/>
@@ -19100,7 +19070,9 @@
           <w:b/>
           <w:bCs/>
           <w:szCs w:val="24"/>
-        </w:rPr>
+          <w:highlight w:val="yellow"/>
+        </w:rPr>
+        <w:lastRenderedPageBreak/>
         <w:t>Política de Privacidade</w:t>
       </w:r>
       <w:bookmarkEnd w:id="25"/>
@@ -19110,20 +19082,23 @@
         <w:rPr>
           <w:rFonts w:cs="Arial"/>
           <w:szCs w:val="24"/>
-        </w:rPr>
-      </w:pPr>
-    </w:p>
-    <w:p>
-      <w:pPr>
-        <w:rPr>
-          <w:rFonts w:cs="Arial"/>
-          <w:szCs w:val="24"/>
-        </w:rPr>
-      </w:pPr>
-      <w:r>
-        <w:rPr>
-          <w:rFonts w:cs="Arial"/>
-          <w:szCs w:val="24"/>
+          <w:highlight w:val="yellow"/>
+        </w:rPr>
+      </w:pPr>
+    </w:p>
+    <w:p>
+      <w:pPr>
+        <w:rPr>
+          <w:rFonts w:cs="Arial"/>
+          <w:szCs w:val="24"/>
+          <w:highlight w:val="yellow"/>
+        </w:rPr>
+      </w:pPr>
+      <w:r>
+        <w:rPr>
+          <w:rFonts w:cs="Arial"/>
+          <w:szCs w:val="24"/>
+          <w:highlight w:val="yellow"/>
         </w:rPr>
         <w:t xml:space="preserve">Política </w:t>
       </w:r>
@@ -19132,6 +19107,7 @@
         <w:rPr>
           <w:rFonts w:cs="Arial"/>
           <w:szCs w:val="24"/>
+          <w:highlight w:val="yellow"/>
         </w:rPr>
         <w:t>PrivacidadeA</w:t>
       </w:r>
@@ -19140,6 +19116,7 @@
         <w:rPr>
           <w:rFonts w:cs="Arial"/>
           <w:szCs w:val="24"/>
+          <w:highlight w:val="yellow"/>
         </w:rPr>
         <w:t xml:space="preserve"> sua privacidade é importante para nós. É política do </w:t>
       </w:r>
@@ -19148,6 +19125,7 @@
         <w:rPr>
           <w:rFonts w:cs="Arial"/>
           <w:szCs w:val="24"/>
+          <w:highlight w:val="yellow"/>
         </w:rPr>
         <w:t>gestoon</w:t>
       </w:r>
@@ -19156,6 +19134,7 @@
         <w:rPr>
           <w:rFonts w:cs="Arial"/>
           <w:szCs w:val="24"/>
+          <w:highlight w:val="yellow"/>
         </w:rPr>
         <w:t xml:space="preserve"> respeitar a sua privacidade em relação a qualquer informação sua que possamos coletar no site </w:t>
       </w:r>
@@ -19164,6 +19143,7 @@
         <w:rPr>
           <w:rFonts w:cs="Arial"/>
           <w:szCs w:val="24"/>
+          <w:highlight w:val="yellow"/>
         </w:rPr>
         <w:t>gestoon</w:t>
       </w:r>
@@ -19172,6 +19152,7 @@
         <w:rPr>
           <w:rFonts w:cs="Arial"/>
           <w:szCs w:val="24"/>
+          <w:highlight w:val="yellow"/>
         </w:rPr>
         <w:t xml:space="preserve">, e outros sites que possuímos e </w:t>
       </w:r>
@@ -19181,6 +19162,7 @@
         <w:rPr>
           <w:rFonts w:cs="Arial"/>
           <w:szCs w:val="24"/>
+          <w:highlight w:val="yellow"/>
         </w:rPr>
         <w:t>operamos.Solicitamos</w:t>
       </w:r>
@@ -19190,6 +19172,7 @@
         <w:rPr>
           <w:rFonts w:cs="Arial"/>
           <w:szCs w:val="24"/>
+          <w:highlight w:val="yellow"/>
         </w:rPr>
         <w:t xml:space="preserve"> informações pessoais apenas quando realmente precisamos delas para lhe </w:t>
       </w:r>
@@ -19198,6 +19181,7 @@
         <w:rPr>
           <w:rFonts w:cs="Arial"/>
           <w:szCs w:val="24"/>
+          <w:highlight w:val="yellow"/>
         </w:rPr>
         <w:t>fornecer</w:t>
       </w:r>
@@ -19206,6 +19190,7 @@
         <w:rPr>
           <w:rFonts w:cs="Arial"/>
           <w:szCs w:val="24"/>
+          <w:highlight w:val="yellow"/>
         </w:rPr>
         <w:t xml:space="preserve"> um serviço. Fazemo-lo por meios justos e legais, com o seu conhecimento e consentimento. Também informamos por que estamos coletando e como será </w:t>
       </w:r>
@@ -19215,6 +19200,7 @@
         <w:rPr>
           <w:rFonts w:cs="Arial"/>
           <w:szCs w:val="24"/>
+          <w:highlight w:val="yellow"/>
         </w:rPr>
         <w:t>usado.Apenas</w:t>
       </w:r>
@@ -19224,6 +19210,7 @@
         <w:rPr>
           <w:rFonts w:cs="Arial"/>
           <w:szCs w:val="24"/>
+          <w:highlight w:val="yellow"/>
         </w:rPr>
         <w:t xml:space="preserve"> retemos as informações coletadas pelo tempo necessário para fornecer o serviço solicitado. Quando armazenamos dados, protegemos dentro de meios comercialmente aceitáveis ​​para evitar perdas e roubos, bem como acesso, divulgação, cópia, uso ou modificação não </w:t>
       </w:r>
@@ -19233,6 +19220,7 @@
         <w:rPr>
           <w:rFonts w:cs="Arial"/>
           <w:szCs w:val="24"/>
+          <w:highlight w:val="yellow"/>
         </w:rPr>
         <w:t>autorizados.Não</w:t>
       </w:r>
@@ -19242,6 +19230,7 @@
         <w:rPr>
           <w:rFonts w:cs="Arial"/>
           <w:szCs w:val="24"/>
+          <w:highlight w:val="yellow"/>
         </w:rPr>
         <w:t xml:space="preserve"> compartilhamos informações de identificação pessoal publicamente ou com terceiros, exceto quando exigido por </w:t>
       </w:r>
@@ -19250,6 +19239,7 @@
         <w:rPr>
           <w:rFonts w:cs="Arial"/>
           <w:szCs w:val="24"/>
+          <w:highlight w:val="yellow"/>
         </w:rPr>
         <w:t>lei.O</w:t>
       </w:r>
@@ -19258,6 +19248,7 @@
         <w:rPr>
           <w:rFonts w:cs="Arial"/>
           <w:szCs w:val="24"/>
+          <w:highlight w:val="yellow"/>
         </w:rPr>
         <w:t xml:space="preserve"> nosso site pode ter links para sites externos que não são operados por nós. Esteja ciente de que não temos controle sobre o conteúdo e práticas desses sites e não podemos aceitar responsabilidade por suas respectivas políticas de </w:t>
       </w:r>
@@ -19267,6 +19258,7 @@
         <w:rPr>
           <w:rFonts w:cs="Arial"/>
           <w:szCs w:val="24"/>
+          <w:highlight w:val="yellow"/>
         </w:rPr>
         <w:t>privacidade.Você</w:t>
       </w:r>
@@ -19276,6 +19268,7 @@
         <w:rPr>
           <w:rFonts w:cs="Arial"/>
           <w:szCs w:val="24"/>
+          <w:highlight w:val="yellow"/>
         </w:rPr>
         <w:t xml:space="preserve"> é livre para recusar a nossa solicitação de informações pessoais, entendendo que talvez não possamos </w:t>
       </w:r>
@@ -19284,6 +19277,7 @@
         <w:rPr>
           <w:rFonts w:cs="Arial"/>
           <w:szCs w:val="24"/>
+          <w:highlight w:val="yellow"/>
         </w:rPr>
         <w:t>fornecer</w:t>
       </w:r>
@@ -19292,6 +19286,7 @@
         <w:rPr>
           <w:rFonts w:cs="Arial"/>
           <w:szCs w:val="24"/>
+          <w:highlight w:val="yellow"/>
         </w:rPr>
         <w:t xml:space="preserve"> alguns dos serviços </w:t>
       </w:r>
@@ -19300,6 +19295,7 @@
         <w:rPr>
           <w:rFonts w:cs="Arial"/>
           <w:szCs w:val="24"/>
+          <w:highlight w:val="yellow"/>
         </w:rPr>
         <w:t>desejados.O</w:t>
       </w:r>
@@ -19308,302 +19304,340 @@
         <w:rPr>
           <w:rFonts w:cs="Arial"/>
           <w:szCs w:val="24"/>
-        </w:rPr>
-        <w:t xml:space="preserve"> uso continuado de nosso site será considerado como aceitação de nossas práticas em torno de privacidade e informações pessoais. Se você tiver alguma dúvida sobre como </w:t>
-      </w:r>
-      <w:r>
-        <w:rPr>
-          <w:rFonts w:cs="Arial"/>
-          <w:szCs w:val="24"/>
+          <w:highlight w:val="yellow"/>
+        </w:rPr>
+        <w:t xml:space="preserve"> uso continuado de nosso site será considerado como aceitação de nossas práticas em torno de privacidade e informações pessoais. Se você tiver alguma dúvida sobre como lidamos com dados do usuário e informações pessoais, entre em contacto </w:t>
+      </w:r>
+      <w:proofErr w:type="spellStart"/>
+      <w:r>
+        <w:rPr>
+          <w:rFonts w:cs="Arial"/>
+          <w:szCs w:val="24"/>
+          <w:highlight w:val="yellow"/>
+        </w:rPr>
+        <w:t>connosco.O</w:t>
+      </w:r>
+      <w:proofErr w:type="spellEnd"/>
+      <w:r>
+        <w:rPr>
+          <w:rFonts w:cs="Arial"/>
+          <w:szCs w:val="24"/>
+          <w:highlight w:val="yellow"/>
+        </w:rPr>
+        <w:t xml:space="preserve"> serviço Google </w:t>
+      </w:r>
+      <w:proofErr w:type="spellStart"/>
+      <w:r>
+        <w:rPr>
+          <w:rFonts w:cs="Arial"/>
+          <w:szCs w:val="24"/>
+          <w:highlight w:val="yellow"/>
+        </w:rPr>
+        <w:t>AdSense</w:t>
+      </w:r>
+      <w:proofErr w:type="spellEnd"/>
+      <w:r>
+        <w:rPr>
+          <w:rFonts w:cs="Arial"/>
+          <w:szCs w:val="24"/>
+          <w:highlight w:val="yellow"/>
+        </w:rPr>
+        <w:t xml:space="preserve"> que usamos para veicular publicidade usa um cookie </w:t>
+      </w:r>
+      <w:proofErr w:type="spellStart"/>
+      <w:r>
+        <w:rPr>
+          <w:rFonts w:cs="Arial"/>
+          <w:szCs w:val="24"/>
+          <w:highlight w:val="yellow"/>
+        </w:rPr>
+        <w:t>DoubleClick</w:t>
+      </w:r>
+      <w:proofErr w:type="spellEnd"/>
+      <w:r>
+        <w:rPr>
+          <w:rFonts w:cs="Arial"/>
+          <w:szCs w:val="24"/>
+          <w:highlight w:val="yellow"/>
+        </w:rPr>
+        <w:t xml:space="preserve"> para veicular anúncios mais relevantes em toda a Web e limitar o número de vezes que um determinado anúncio é exibido para </w:t>
+      </w:r>
+      <w:proofErr w:type="spellStart"/>
+      <w:r>
+        <w:rPr>
+          <w:rFonts w:cs="Arial"/>
+          <w:szCs w:val="24"/>
+          <w:highlight w:val="yellow"/>
+        </w:rPr>
+        <w:t>você.Para</w:t>
+      </w:r>
+      <w:proofErr w:type="spellEnd"/>
+      <w:r>
+        <w:rPr>
+          <w:rFonts w:cs="Arial"/>
+          <w:szCs w:val="24"/>
+          <w:highlight w:val="yellow"/>
+        </w:rPr>
+        <w:t xml:space="preserve"> mais informações sobre o Google </w:t>
+      </w:r>
+      <w:proofErr w:type="spellStart"/>
+      <w:r>
+        <w:rPr>
+          <w:rFonts w:cs="Arial"/>
+          <w:szCs w:val="24"/>
+          <w:highlight w:val="yellow"/>
+        </w:rPr>
+        <w:t>AdSense</w:t>
+      </w:r>
+      <w:proofErr w:type="spellEnd"/>
+      <w:r>
+        <w:rPr>
+          <w:rFonts w:cs="Arial"/>
+          <w:szCs w:val="24"/>
+          <w:highlight w:val="yellow"/>
+        </w:rPr>
+        <w:t xml:space="preserve">, consulte as </w:t>
+      </w:r>
+      <w:proofErr w:type="spellStart"/>
+      <w:r>
+        <w:rPr>
+          <w:rFonts w:cs="Arial"/>
+          <w:szCs w:val="24"/>
+          <w:highlight w:val="yellow"/>
+        </w:rPr>
+        <w:t>FAQs</w:t>
+      </w:r>
+      <w:proofErr w:type="spellEnd"/>
+      <w:r>
+        <w:rPr>
+          <w:rFonts w:cs="Arial"/>
+          <w:szCs w:val="24"/>
+          <w:highlight w:val="yellow"/>
+        </w:rPr>
+        <w:t xml:space="preserve"> oficiais sobre privacidade do Google </w:t>
+      </w:r>
+      <w:proofErr w:type="spellStart"/>
+      <w:r>
+        <w:rPr>
+          <w:rFonts w:cs="Arial"/>
+          <w:szCs w:val="24"/>
+          <w:highlight w:val="yellow"/>
+        </w:rPr>
+        <w:t>AdSense.Utilizamos</w:t>
+      </w:r>
+      <w:proofErr w:type="spellEnd"/>
+      <w:r>
+        <w:rPr>
+          <w:rFonts w:cs="Arial"/>
+          <w:szCs w:val="24"/>
+          <w:highlight w:val="yellow"/>
+        </w:rPr>
+        <w:t xml:space="preserve"> anúncios para compensar os custos de funcionamento deste site e fornecer financiamento para futuros desenvolvimentos. Os cookies de publicidade comportamental usados ​​por este site foram projetados para garantir que você forneça os anúncios mais relevantes sempre que possível, rastreando anonimamente seus interesses e apresentando coisas semelhantes que possam ser do seu </w:t>
+      </w:r>
+      <w:proofErr w:type="spellStart"/>
+      <w:r>
+        <w:rPr>
+          <w:rFonts w:cs="Arial"/>
+          <w:szCs w:val="24"/>
+          <w:highlight w:val="yellow"/>
+        </w:rPr>
+        <w:t>interesse.Vários</w:t>
+      </w:r>
+      <w:proofErr w:type="spellEnd"/>
+      <w:r>
+        <w:rPr>
+          <w:rFonts w:cs="Arial"/>
+          <w:szCs w:val="24"/>
+          <w:highlight w:val="yellow"/>
+        </w:rPr>
+        <w:t xml:space="preserve"> parceiros anunciam em nosso nome e os cookies de rastreamento de afiliados simplesmente nos permitem ver se nossos clientes acessaram o site através de um dos sites de nossos parceiros, para que possamos creditá-los </w:t>
+      </w:r>
+      <w:r>
+        <w:rPr>
+          <w:rFonts w:cs="Arial"/>
+          <w:szCs w:val="24"/>
+          <w:highlight w:val="yellow"/>
         </w:rPr>
         <w:lastRenderedPageBreak/>
-        <w:t xml:space="preserve">lidamos com dados do usuário e informações pessoais, entre em contacto </w:t>
+        <w:t xml:space="preserve">adequadamente e, quando aplicável, permitir que nossos parceiros afiliados ofereçam qualquer promoção que pode fornecê-lo para fazer uma </w:t>
       </w:r>
       <w:proofErr w:type="spellStart"/>
       <w:r>
         <w:rPr>
           <w:rFonts w:cs="Arial"/>
           <w:szCs w:val="24"/>
-        </w:rPr>
-        <w:t>connosco.O</w:t>
+          <w:highlight w:val="yellow"/>
+        </w:rPr>
+        <w:t>compra.Compromisso</w:t>
       </w:r>
       <w:proofErr w:type="spellEnd"/>
       <w:r>
         <w:rPr>
           <w:rFonts w:cs="Arial"/>
           <w:szCs w:val="24"/>
-        </w:rPr>
-        <w:t xml:space="preserve"> serviço Google </w:t>
+          <w:highlight w:val="yellow"/>
+        </w:rPr>
+        <w:t xml:space="preserve"> do </w:t>
       </w:r>
       <w:proofErr w:type="spellStart"/>
       <w:r>
         <w:rPr>
           <w:rFonts w:cs="Arial"/>
           <w:szCs w:val="24"/>
-        </w:rPr>
-        <w:t>AdSense</w:t>
+          <w:highlight w:val="yellow"/>
+        </w:rPr>
+        <w:t>UsuárioO</w:t>
       </w:r>
       <w:proofErr w:type="spellEnd"/>
       <w:r>
         <w:rPr>
           <w:rFonts w:cs="Arial"/>
           <w:szCs w:val="24"/>
-        </w:rPr>
-        <w:t xml:space="preserve"> que usamos para veicular publicidade usa um cookie </w:t>
+          <w:highlight w:val="yellow"/>
+        </w:rPr>
+        <w:t xml:space="preserve"> usuário se compromete a fazer uso adequado dos conteúdos e da informação que o </w:t>
       </w:r>
       <w:proofErr w:type="spellStart"/>
       <w:r>
         <w:rPr>
           <w:rFonts w:cs="Arial"/>
           <w:szCs w:val="24"/>
-        </w:rPr>
-        <w:t>DoubleClick</w:t>
+          <w:highlight w:val="yellow"/>
+        </w:rPr>
+        <w:t>gestoon</w:t>
       </w:r>
       <w:proofErr w:type="spellEnd"/>
       <w:r>
         <w:rPr>
           <w:rFonts w:cs="Arial"/>
           <w:szCs w:val="24"/>
-        </w:rPr>
-        <w:t xml:space="preserve"> para veicular anúncios mais relevantes em toda a Web e limitar o número de vezes que um determinado anúncio é exibido para </w:t>
+          <w:highlight w:val="yellow"/>
+        </w:rPr>
+        <w:t xml:space="preserve"> oferece no site e com caráter enunciativo, mas não </w:t>
       </w:r>
       <w:proofErr w:type="spellStart"/>
       <w:r>
         <w:rPr>
           <w:rFonts w:cs="Arial"/>
           <w:szCs w:val="24"/>
-        </w:rPr>
-        <w:t>você.Para</w:t>
+          <w:highlight w:val="yellow"/>
+        </w:rPr>
+        <w:t>limitativo:A</w:t>
       </w:r>
       <w:proofErr w:type="spellEnd"/>
       <w:r>
         <w:rPr>
           <w:rFonts w:cs="Arial"/>
           <w:szCs w:val="24"/>
-        </w:rPr>
-        <w:t xml:space="preserve"> mais informações sobre o Google </w:t>
+          <w:highlight w:val="yellow"/>
+        </w:rPr>
+        <w:t xml:space="preserve">) Não se envolver em atividades que sejam ilegais ou contrárias à boa fé a à ordem </w:t>
       </w:r>
       <w:proofErr w:type="spellStart"/>
       <w:r>
         <w:rPr>
           <w:rFonts w:cs="Arial"/>
           <w:szCs w:val="24"/>
-        </w:rPr>
-        <w:t>AdSense</w:t>
+          <w:highlight w:val="yellow"/>
+        </w:rPr>
+        <w:t>pública;B</w:t>
       </w:r>
       <w:proofErr w:type="spellEnd"/>
       <w:r>
         <w:rPr>
           <w:rFonts w:cs="Arial"/>
           <w:szCs w:val="24"/>
-        </w:rPr>
-        <w:t xml:space="preserve">, consulte as </w:t>
+          <w:highlight w:val="yellow"/>
+        </w:rPr>
+        <w:t xml:space="preserve">) Não difundir propaganda ou conteúdo de natureza racista, xenofóbica, jogos de sorte ou azar, qualquer tipo de pornografia ilegal, de apologia ao terrorismo ou contra os direitos </w:t>
       </w:r>
       <w:proofErr w:type="spellStart"/>
       <w:r>
         <w:rPr>
           <w:rFonts w:cs="Arial"/>
           <w:szCs w:val="24"/>
-        </w:rPr>
-        <w:t>FAQs</w:t>
+          <w:highlight w:val="yellow"/>
+        </w:rPr>
+        <w:t>humanos;C</w:t>
       </w:r>
       <w:proofErr w:type="spellEnd"/>
       <w:r>
         <w:rPr>
           <w:rFonts w:cs="Arial"/>
           <w:szCs w:val="24"/>
-        </w:rPr>
-        <w:t xml:space="preserve"> oficiais sobre privacidade do Google </w:t>
+          <w:highlight w:val="yellow"/>
+        </w:rPr>
+        <w:t xml:space="preserve">) Não causar danos aos sistemas físicos (hardwares) e lógicos (softwares) do </w:t>
       </w:r>
       <w:proofErr w:type="spellStart"/>
       <w:r>
         <w:rPr>
           <w:rFonts w:cs="Arial"/>
           <w:szCs w:val="24"/>
-        </w:rPr>
-        <w:t>AdSense.Utilizamos</w:t>
+          <w:highlight w:val="yellow"/>
+        </w:rPr>
+        <w:t>gestoon</w:t>
       </w:r>
       <w:proofErr w:type="spellEnd"/>
       <w:r>
         <w:rPr>
           <w:rFonts w:cs="Arial"/>
           <w:szCs w:val="24"/>
-        </w:rPr>
-        <w:t xml:space="preserve"> anúncios para compensar os custos de funcionamento deste site e fornecer financiamento para futuros desenvolvimentos. Os cookies de publicidade comportamental usados ​​por este site foram projetados para garantir que você forneça os anúncios mais relevantes sempre que possível, rastreando anonimamente seus interesses e apresentando coisas semelhantes que possam ser do seu </w:t>
+          <w:highlight w:val="yellow"/>
+        </w:rPr>
+        <w:t xml:space="preserve">, de seus fornecedores ou terceiros, para introduzir ou disseminar vírus informáticos ou quaisquer outros sistemas de hardware ou software que sejam capazes de causar danos anteriormente </w:t>
       </w:r>
       <w:proofErr w:type="spellStart"/>
       <w:r>
         <w:rPr>
           <w:rFonts w:cs="Arial"/>
           <w:szCs w:val="24"/>
-        </w:rPr>
-        <w:t>interesse.Vários</w:t>
+          <w:highlight w:val="yellow"/>
+        </w:rPr>
+        <w:t>mencionados.Mais</w:t>
       </w:r>
       <w:proofErr w:type="spellEnd"/>
       <w:r>
         <w:rPr>
           <w:rFonts w:cs="Arial"/>
           <w:szCs w:val="24"/>
-        </w:rPr>
-        <w:t xml:space="preserve"> parceiros anunciam em nosso nome e os cookies de rastreamento de afiliados simplesmente nos permitem ver se nossos clientes acessaram o site através de um dos sites de nossos parceiros, para que possamos creditá-los adequadamente e, quando aplicável, permitir que nossos parceiros afiliados ofereçam qualquer promoção que pode fornecê-lo para fazer uma </w:t>
+          <w:highlight w:val="yellow"/>
+        </w:rPr>
+        <w:t xml:space="preserve"> </w:t>
       </w:r>
       <w:proofErr w:type="spellStart"/>
       <w:r>
         <w:rPr>
           <w:rFonts w:cs="Arial"/>
           <w:szCs w:val="24"/>
-        </w:rPr>
-        <w:t>compra.Compromisso</w:t>
+          <w:highlight w:val="yellow"/>
+        </w:rPr>
+        <w:t>informaçõesEsperemos</w:t>
       </w:r>
       <w:proofErr w:type="spellEnd"/>
       <w:r>
         <w:rPr>
           <w:rFonts w:cs="Arial"/>
           <w:szCs w:val="24"/>
-        </w:rPr>
-        <w:t xml:space="preserve"> do </w:t>
+          <w:highlight w:val="yellow"/>
+        </w:rPr>
+        <w:t xml:space="preserve"> que esteja esclarecido e, como mencionado anteriormente, se houver algo que você não tem certeza se precisa ou não, geralmente é mais seguro deixar os cookies ativados, caso interaja com um dos recursos que você usa em nosso </w:t>
       </w:r>
       <w:proofErr w:type="spellStart"/>
       <w:r>
         <w:rPr>
           <w:rFonts w:cs="Arial"/>
           <w:szCs w:val="24"/>
-        </w:rPr>
-        <w:t>UsuárioO</w:t>
+          <w:highlight w:val="yellow"/>
+        </w:rPr>
+        <w:t>site.Esta</w:t>
       </w:r>
       <w:proofErr w:type="spellEnd"/>
       <w:r>
         <w:rPr>
           <w:rFonts w:cs="Arial"/>
           <w:szCs w:val="24"/>
-        </w:rPr>
-        <w:t xml:space="preserve"> usuário se compromete a fazer uso adequado dos conteúdos e da informação que o </w:t>
-      </w:r>
-      <w:proofErr w:type="spellStart"/>
-      <w:r>
-        <w:rPr>
-          <w:rFonts w:cs="Arial"/>
-          <w:szCs w:val="24"/>
-        </w:rPr>
-        <w:t>gestoon</w:t>
-      </w:r>
-      <w:proofErr w:type="spellEnd"/>
-      <w:r>
-        <w:rPr>
-          <w:rFonts w:cs="Arial"/>
-          <w:szCs w:val="24"/>
-        </w:rPr>
-        <w:t xml:space="preserve"> oferece no site e com caráter enunciativo, mas não </w:t>
-      </w:r>
-      <w:proofErr w:type="spellStart"/>
-      <w:r>
-        <w:rPr>
-          <w:rFonts w:cs="Arial"/>
-          <w:szCs w:val="24"/>
-        </w:rPr>
-        <w:t>limitativo:A</w:t>
-      </w:r>
-      <w:proofErr w:type="spellEnd"/>
-      <w:r>
-        <w:rPr>
-          <w:rFonts w:cs="Arial"/>
-          <w:szCs w:val="24"/>
-        </w:rPr>
-        <w:t xml:space="preserve">) Não se envolver em atividades que sejam ilegais ou contrárias à boa fé a à ordem </w:t>
-      </w:r>
-      <w:proofErr w:type="spellStart"/>
-      <w:r>
-        <w:rPr>
-          <w:rFonts w:cs="Arial"/>
-          <w:szCs w:val="24"/>
-        </w:rPr>
-        <w:t>pública;B</w:t>
-      </w:r>
-      <w:proofErr w:type="spellEnd"/>
-      <w:r>
-        <w:rPr>
-          <w:rFonts w:cs="Arial"/>
-          <w:szCs w:val="24"/>
-        </w:rPr>
-        <w:t xml:space="preserve">) Não difundir propaganda ou conteúdo de natureza racista, xenofóbica, jogos de sorte ou azar, qualquer tipo de pornografia ilegal, de apologia ao terrorismo ou contra os direitos </w:t>
-      </w:r>
-      <w:proofErr w:type="spellStart"/>
-      <w:r>
-        <w:rPr>
-          <w:rFonts w:cs="Arial"/>
-          <w:szCs w:val="24"/>
-        </w:rPr>
-        <w:t>humanos;C</w:t>
-      </w:r>
-      <w:proofErr w:type="spellEnd"/>
-      <w:r>
-        <w:rPr>
-          <w:rFonts w:cs="Arial"/>
-          <w:szCs w:val="24"/>
-        </w:rPr>
-        <w:t xml:space="preserve">) Não causar danos aos sistemas físicos (hardwares) e lógicos (softwares) do </w:t>
-      </w:r>
-      <w:proofErr w:type="spellStart"/>
-      <w:r>
-        <w:rPr>
-          <w:rFonts w:cs="Arial"/>
-          <w:szCs w:val="24"/>
-        </w:rPr>
-        <w:t>gestoon</w:t>
-      </w:r>
-      <w:proofErr w:type="spellEnd"/>
-      <w:r>
-        <w:rPr>
-          <w:rFonts w:cs="Arial"/>
-          <w:szCs w:val="24"/>
-        </w:rPr>
-        <w:t xml:space="preserve">, de seus fornecedores ou terceiros, para introduzir ou disseminar vírus informáticos ou quaisquer outros sistemas de hardware ou software que sejam capazes de causar danos anteriormente </w:t>
-      </w:r>
-      <w:proofErr w:type="spellStart"/>
-      <w:r>
-        <w:rPr>
-          <w:rFonts w:cs="Arial"/>
-          <w:szCs w:val="24"/>
-        </w:rPr>
-        <w:t>mencionados.Mais</w:t>
-      </w:r>
-      <w:proofErr w:type="spellEnd"/>
-      <w:r>
-        <w:rPr>
-          <w:rFonts w:cs="Arial"/>
-          <w:szCs w:val="24"/>
-        </w:rPr>
-        <w:t xml:space="preserve"> </w:t>
-      </w:r>
-      <w:proofErr w:type="spellStart"/>
-      <w:r>
-        <w:rPr>
-          <w:rFonts w:cs="Arial"/>
-          <w:szCs w:val="24"/>
-        </w:rPr>
-        <w:t>informaçõesEsperemos</w:t>
-      </w:r>
-      <w:proofErr w:type="spellEnd"/>
-      <w:r>
-        <w:rPr>
-          <w:rFonts w:cs="Arial"/>
-          <w:szCs w:val="24"/>
-        </w:rPr>
-        <w:t xml:space="preserve"> que esteja esclarecido e, como mencionado anteriormente, se houver algo que você não tem certeza se precisa ou não, geralmente é mais seguro deixar os cookies ativados, caso interaja com um dos recursos que você usa em nosso </w:t>
-      </w:r>
-      <w:proofErr w:type="spellStart"/>
-      <w:r>
-        <w:rPr>
-          <w:rFonts w:cs="Arial"/>
-          <w:szCs w:val="24"/>
-        </w:rPr>
-        <w:t>site.Esta</w:t>
-      </w:r>
-      <w:proofErr w:type="spellEnd"/>
-      <w:r>
-        <w:rPr>
-          <w:rFonts w:cs="Arial"/>
-          <w:szCs w:val="24"/>
+          <w:highlight w:val="yellow"/>
         </w:rPr>
         <w:t xml:space="preserve"> política é efetiva a partir de 28 May 2026 01:11</w:t>
       </w:r>
@@ -19613,111 +19647,43 @@
         <w:rPr>
           <w:rFonts w:cs="Arial"/>
           <w:szCs w:val="24"/>
-        </w:rPr>
-      </w:pPr>
-    </w:p>
-    <w:p>
-      <w:pPr>
-        <w:rPr>
-          <w:rFonts w:cs="Arial"/>
-          <w:szCs w:val="24"/>
-        </w:rPr>
-      </w:pPr>
-    </w:p>
-    <w:p>
-      <w:pPr>
-        <w:rPr>
-          <w:rFonts w:cs="Arial"/>
-          <w:szCs w:val="24"/>
-        </w:rPr>
-      </w:pPr>
-    </w:p>
-    <w:p>
-      <w:pPr>
-        <w:rPr>
-          <w:rFonts w:cs="Arial"/>
-          <w:szCs w:val="24"/>
-        </w:rPr>
-      </w:pPr>
-    </w:p>
-    <w:p>
-      <w:pPr>
-        <w:rPr>
-          <w:rFonts w:cs="Arial"/>
-          <w:szCs w:val="24"/>
-        </w:rPr>
-      </w:pPr>
-    </w:p>
-    <w:p>
-      <w:pPr>
-        <w:rPr>
-          <w:rFonts w:cs="Arial"/>
-          <w:szCs w:val="24"/>
-        </w:rPr>
-      </w:pPr>
-    </w:p>
-    <w:p>
-      <w:pPr>
-        <w:rPr>
-          <w:rFonts w:cs="Arial"/>
-          <w:szCs w:val="24"/>
-        </w:rPr>
-      </w:pPr>
-    </w:p>
-    <w:p>
-      <w:pPr>
-        <w:rPr>
-          <w:rFonts w:cs="Arial"/>
-          <w:szCs w:val="24"/>
-        </w:rPr>
-      </w:pPr>
-    </w:p>
-    <w:p>
-      <w:pPr>
-        <w:rPr>
-          <w:rFonts w:cs="Arial"/>
-          <w:szCs w:val="24"/>
-        </w:rPr>
-      </w:pPr>
-    </w:p>
-    <w:p>
-      <w:pPr>
-        <w:rPr>
-          <w:rFonts w:cs="Arial"/>
-          <w:szCs w:val="24"/>
-        </w:rPr>
-      </w:pPr>
-    </w:p>
-    <w:p>
-      <w:pPr>
-        <w:rPr>
-          <w:rFonts w:cs="Arial"/>
-          <w:szCs w:val="24"/>
-          <w:u w:val="single"/>
-        </w:rPr>
-      </w:pPr>
-    </w:p>
-    <w:p>
-      <w:pPr>
-        <w:rPr>
-          <w:rFonts w:cs="Arial"/>
-          <w:szCs w:val="24"/>
-        </w:rPr>
-      </w:pPr>
-    </w:p>
-    <w:p>
-      <w:pPr>
-        <w:rPr>
-          <w:rFonts w:cs="Arial"/>
-          <w:szCs w:val="24"/>
-        </w:rPr>
-      </w:pPr>
-    </w:p>
-    <w:p>
-      <w:pPr>
-        <w:rPr>
-          <w:rFonts w:cs="Arial"/>
-          <w:szCs w:val="24"/>
+          <w:highlight w:val="yellow"/>
+        </w:rPr>
+      </w:pPr>
+    </w:p>
+    <w:p>
+      <w:pPr>
+        <w:rPr>
+          <w:rFonts w:cs="Arial"/>
+          <w:szCs w:val="24"/>
+          <w:highlight w:val="yellow"/>
+        </w:rPr>
+      </w:pPr>
+    </w:p>
+    <w:p>
+      <w:pPr>
+        <w:rPr>
+          <w:rFonts w:cs="Arial"/>
+          <w:szCs w:val="24"/>
+          <w:highlight w:val="yellow"/>
+        </w:rPr>
+      </w:pPr>
+    </w:p>
+    <w:p>
+      <w:pPr>
+        <w:rPr>
+          <w:rFonts w:cs="Arial"/>
+          <w:szCs w:val="24"/>
+          <w:highlight w:val="yellow"/>
+        </w:rPr>
+      </w:pPr>
+    </w:p>
+    <w:p>
+      <w:pPr>
+        <w:rPr>
+          <w:rFonts w:cs="Arial"/>
+          <w:szCs w:val="24"/>
+          <w:highlight w:val="yellow"/>
         </w:rPr>
       </w:pPr>
     </w:p>
@@ -19733,6 +19699,7 @@
         <w:rPr>
           <w:rFonts w:cs="Arial"/>
           <w:szCs w:val="24"/>
+          <w:highlight w:val="yellow"/>
         </w:rPr>
       </w:pPr>
       <w:bookmarkStart w:id="26" w:name="_Toc193385951"/>
@@ -19742,6 +19709,7 @@
           <w:b/>
           <w:bCs/>
           <w:szCs w:val="24"/>
+          <w:highlight w:val="yellow"/>
         </w:rPr>
         <w:t>Termos de Uso</w:t>
       </w:r>
@@ -19759,6 +19727,7 @@
         <w:rPr>
           <w:rFonts w:cs="Arial"/>
           <w:szCs w:val="24"/>
+          <w:highlight w:val="yellow"/>
         </w:rPr>
         <w:t xml:space="preserve">1. </w:t>
       </w:r>
@@ -19767,6 +19736,7 @@
         <w:rPr>
           <w:rFonts w:cs="Arial"/>
           <w:szCs w:val="24"/>
+          <w:highlight w:val="yellow"/>
         </w:rPr>
         <w:t>TermosAo</w:t>
       </w:r>
@@ -19775,6 +19745,7 @@
         <w:rPr>
           <w:rFonts w:cs="Arial"/>
           <w:szCs w:val="24"/>
+          <w:highlight w:val="yellow"/>
         </w:rPr>
         <w:t xml:space="preserve"> acessar ao site </w:t>
       </w:r>
@@ -19783,6 +19754,7 @@
         <w:rPr>
           <w:rFonts w:cs="Arial"/>
           <w:szCs w:val="24"/>
+          <w:highlight w:val="yellow"/>
         </w:rPr>
         <w:t>gestoon</w:t>
       </w:r>
@@ -19791,6 +19763,7 @@
         <w:rPr>
           <w:rFonts w:cs="Arial"/>
           <w:szCs w:val="24"/>
+          <w:highlight w:val="yellow"/>
         </w:rPr>
         <w:t xml:space="preserve">, concorda em cumprir estes termos de serviço, todas as leis e regulamentos aplicáveis ​​e concorda que é responsável pelo cumprimento de todas as leis locais aplicáveis. Se você não concordar com algum desses termos, está proibido de usar ou acessar este site. Os materiais contidos neste site são protegidos pelas leis de direitos autorais e marcas comerciais aplicáveis.2. Uso de </w:t>
       </w:r>
@@ -19799,6 +19772,7 @@
         <w:rPr>
           <w:rFonts w:cs="Arial"/>
           <w:szCs w:val="24"/>
+          <w:highlight w:val="yellow"/>
         </w:rPr>
         <w:t>LicençaÉ</w:t>
       </w:r>
@@ -19807,6 +19781,7 @@
         <w:rPr>
           <w:rFonts w:cs="Arial"/>
           <w:szCs w:val="24"/>
+          <w:highlight w:val="yellow"/>
         </w:rPr>
         <w:t xml:space="preserve"> concedida permissão para baixar temporariamente uma cópia dos materiais (informações ou software) no site </w:t>
       </w:r>
@@ -19816,6 +19791,7 @@
         <w:rPr>
           <w:rFonts w:cs="Arial"/>
           <w:szCs w:val="24"/>
+          <w:highlight w:val="yellow"/>
         </w:rPr>
         <w:t>gestoon</w:t>
       </w:r>
@@ -19824,6 +19800,7 @@
         <w:rPr>
           <w:rFonts w:cs="Arial"/>
           <w:szCs w:val="24"/>
+          <w:highlight w:val="yellow"/>
         </w:rPr>
         <w:t xml:space="preserve"> ,</w:t>
       </w:r>
@@ -19832,6 +19809,7 @@
         <w:rPr>
           <w:rFonts w:cs="Arial"/>
           <w:szCs w:val="24"/>
+          <w:highlight w:val="yellow"/>
         </w:rPr>
         <w:t xml:space="preserve"> apenas para visualização transitória pessoal e não comercial. Esta é a concessão de uma licença, não uma transferência de título e, sob esta licença, você não pode: modificar ou copiar os materiais; usar os materiais para qualquer finalidade comercial ou para exibição pública (comercial ou não comercial); tentar </w:t>
       </w:r>
@@ -19840,6 +19818,7 @@
         <w:rPr>
           <w:rFonts w:cs="Arial"/>
           <w:szCs w:val="24"/>
+          <w:highlight w:val="yellow"/>
         </w:rPr>
         <w:t>descompilar</w:t>
       </w:r>
@@ -19848,14 +19827,25 @@
         <w:rPr>
           <w:rFonts w:cs="Arial"/>
           <w:szCs w:val="24"/>
-        </w:rPr>
-        <w:t xml:space="preserve"> ou fazer engenharia reversa de qualquer software contido no site </w:t>
+          <w:highlight w:val="yellow"/>
+        </w:rPr>
+        <w:t xml:space="preserve"> ou fazer engenharia reversa </w:t>
+      </w:r>
+      <w:r>
+        <w:rPr>
+          <w:rFonts w:cs="Arial"/>
+          <w:szCs w:val="24"/>
+          <w:highlight w:val="yellow"/>
+        </w:rPr>
+        <w:lastRenderedPageBreak/>
+        <w:t xml:space="preserve">de qualquer software contido no site </w:t>
       </w:r>
       <w:proofErr w:type="spellStart"/>
       <w:r>
         <w:rPr>
           <w:rFonts w:cs="Arial"/>
           <w:szCs w:val="24"/>
+          <w:highlight w:val="yellow"/>
         </w:rPr>
         <w:t>gestoon</w:t>
       </w:r>
@@ -19864,6 +19854,7 @@
         <w:rPr>
           <w:rFonts w:cs="Arial"/>
           <w:szCs w:val="24"/>
+          <w:highlight w:val="yellow"/>
         </w:rPr>
         <w:t xml:space="preserve">; remover quaisquer direitos autorais ou outras notações de propriedade dos materiais; ou transferir os materiais para outra pessoa ou 'espelhe' os materiais em qualquer outro </w:t>
       </w:r>
@@ -19872,6 +19863,7 @@
         <w:rPr>
           <w:rFonts w:cs="Arial"/>
           <w:szCs w:val="24"/>
+          <w:highlight w:val="yellow"/>
         </w:rPr>
         <w:t>servidor.Esta</w:t>
       </w:r>
@@ -19880,6 +19872,7 @@
         <w:rPr>
           <w:rFonts w:cs="Arial"/>
           <w:szCs w:val="24"/>
+          <w:highlight w:val="yellow"/>
         </w:rPr>
         <w:t xml:space="preserve"> licença será automaticamente rescindida se você violar alguma dessas restrições e poderá ser rescindida por </w:t>
       </w:r>
@@ -19888,6 +19881,7 @@
         <w:rPr>
           <w:rFonts w:cs="Arial"/>
           <w:szCs w:val="24"/>
+          <w:highlight w:val="yellow"/>
         </w:rPr>
         <w:t>gestoon</w:t>
       </w:r>
@@ -19896,6 +19890,7 @@
         <w:rPr>
           <w:rFonts w:cs="Arial"/>
           <w:szCs w:val="24"/>
+          <w:highlight w:val="yellow"/>
         </w:rPr>
         <w:t xml:space="preserve"> a qualquer momento. Ao encerrar a visualização desses materiais ou após o término desta licença, você deve apagar todos os materiais baixados em sua posse, seja em formato </w:t>
       </w:r>
@@ -19904,6 +19899,7 @@
         <w:rPr>
           <w:rFonts w:cs="Arial"/>
           <w:szCs w:val="24"/>
+          <w:highlight w:val="yellow"/>
         </w:rPr>
         <w:t>eletrónico</w:t>
       </w:r>
@@ -19912,6 +19908,7 @@
         <w:rPr>
           <w:rFonts w:cs="Arial"/>
           <w:szCs w:val="24"/>
+          <w:highlight w:val="yellow"/>
         </w:rPr>
         <w:t xml:space="preserve"> ou impresso.3. Isenção de </w:t>
       </w:r>
@@ -19920,6 +19917,7 @@
         <w:rPr>
           <w:rFonts w:cs="Arial"/>
           <w:szCs w:val="24"/>
+          <w:highlight w:val="yellow"/>
         </w:rPr>
         <w:t>responsabilidadeOs</w:t>
       </w:r>
@@ -19928,6 +19926,7 @@
         <w:rPr>
           <w:rFonts w:cs="Arial"/>
           <w:szCs w:val="24"/>
+          <w:highlight w:val="yellow"/>
         </w:rPr>
         <w:t xml:space="preserve"> materiais no site da </w:t>
       </w:r>
@@ -19936,6 +19935,7 @@
         <w:rPr>
           <w:rFonts w:cs="Arial"/>
           <w:szCs w:val="24"/>
+          <w:highlight w:val="yellow"/>
         </w:rPr>
         <w:t>gestoon</w:t>
       </w:r>
@@ -19944,6 +19944,7 @@
         <w:rPr>
           <w:rFonts w:cs="Arial"/>
           <w:szCs w:val="24"/>
+          <w:highlight w:val="yellow"/>
         </w:rPr>
         <w:t xml:space="preserve"> são fornecidos 'como estão'. </w:t>
       </w:r>
@@ -19952,6 +19953,7 @@
         <w:rPr>
           <w:rFonts w:cs="Arial"/>
           <w:szCs w:val="24"/>
+          <w:highlight w:val="yellow"/>
         </w:rPr>
         <w:t>gestoon</w:t>
       </w:r>
@@ -19960,38 +19962,286 @@
         <w:rPr>
           <w:rFonts w:cs="Arial"/>
           <w:szCs w:val="24"/>
+          <w:highlight w:val="yellow"/>
+        </w:rPr>
+        <w:t xml:space="preserve"> não oferece garantias, expressas ou implícitas, e, por este meio, isenta e nega todas as outras garantias, incluindo, sem limitação, garantias implícitas ou condições de comercialização, adequação a um fim específico ou não violação de propriedade intelectual ou outra violação de </w:t>
+      </w:r>
+      <w:proofErr w:type="spellStart"/>
+      <w:r>
+        <w:rPr>
+          <w:rFonts w:cs="Arial"/>
+          <w:szCs w:val="24"/>
+          <w:highlight w:val="yellow"/>
+        </w:rPr>
+        <w:t>direitos.Além</w:t>
+      </w:r>
+      <w:proofErr w:type="spellEnd"/>
+      <w:r>
+        <w:rPr>
+          <w:rFonts w:cs="Arial"/>
+          <w:szCs w:val="24"/>
+          <w:highlight w:val="yellow"/>
+        </w:rPr>
+        <w:t xml:space="preserve"> disso, o </w:t>
+      </w:r>
+      <w:proofErr w:type="spellStart"/>
+      <w:r>
+        <w:rPr>
+          <w:rFonts w:cs="Arial"/>
+          <w:szCs w:val="24"/>
+          <w:highlight w:val="yellow"/>
+        </w:rPr>
+        <w:t>gestoon</w:t>
+      </w:r>
+      <w:proofErr w:type="spellEnd"/>
+      <w:r>
+        <w:rPr>
+          <w:rFonts w:cs="Arial"/>
+          <w:szCs w:val="24"/>
+          <w:highlight w:val="yellow"/>
+        </w:rPr>
+        <w:t xml:space="preserve"> não garante ou faz qualquer representação relativa à precisão, aos resultados prováveis ​​ou à confiabilidade do uso dos materiais em seu site ou de outra forma relacionado a esses materiais ou em sites vinculados a este site.4. </w:t>
+      </w:r>
+      <w:proofErr w:type="spellStart"/>
+      <w:r>
+        <w:rPr>
+          <w:rFonts w:cs="Arial"/>
+          <w:szCs w:val="24"/>
+          <w:highlight w:val="yellow"/>
+        </w:rPr>
+        <w:t>LimitaçõesEm</w:t>
+      </w:r>
+      <w:proofErr w:type="spellEnd"/>
+      <w:r>
+        <w:rPr>
+          <w:rFonts w:cs="Arial"/>
+          <w:szCs w:val="24"/>
+          <w:highlight w:val="yellow"/>
+        </w:rPr>
+        <w:t xml:space="preserve"> nenhum caso o </w:t>
+      </w:r>
+      <w:proofErr w:type="spellStart"/>
+      <w:r>
+        <w:rPr>
+          <w:rFonts w:cs="Arial"/>
+          <w:szCs w:val="24"/>
+          <w:highlight w:val="yellow"/>
+        </w:rPr>
+        <w:t>gestoon</w:t>
+      </w:r>
+      <w:proofErr w:type="spellEnd"/>
+      <w:r>
+        <w:rPr>
+          <w:rFonts w:cs="Arial"/>
+          <w:szCs w:val="24"/>
+          <w:highlight w:val="yellow"/>
+        </w:rPr>
+        <w:t xml:space="preserve"> ou seus fornecedores serão responsáveis ​​por quaisquer danos (incluindo, sem limitação, danos por perda de dados ou lucro ou devido a interrupção dos negócios) decorrentes do uso ou da incapacidade de usar os materiais em </w:t>
+      </w:r>
+      <w:proofErr w:type="spellStart"/>
+      <w:r>
+        <w:rPr>
+          <w:rFonts w:cs="Arial"/>
+          <w:szCs w:val="24"/>
+          <w:highlight w:val="yellow"/>
+        </w:rPr>
+        <w:t>gestoon</w:t>
+      </w:r>
+      <w:proofErr w:type="spellEnd"/>
+      <w:r>
+        <w:rPr>
+          <w:rFonts w:cs="Arial"/>
+          <w:szCs w:val="24"/>
+          <w:highlight w:val="yellow"/>
+        </w:rPr>
+        <w:t xml:space="preserve">, mesmo que </w:t>
+      </w:r>
+      <w:proofErr w:type="spellStart"/>
+      <w:r>
+        <w:rPr>
+          <w:rFonts w:cs="Arial"/>
+          <w:szCs w:val="24"/>
+          <w:highlight w:val="yellow"/>
+        </w:rPr>
+        <w:t>gestoon</w:t>
+      </w:r>
+      <w:proofErr w:type="spellEnd"/>
+      <w:r>
+        <w:rPr>
+          <w:rFonts w:cs="Arial"/>
+          <w:szCs w:val="24"/>
+          <w:highlight w:val="yellow"/>
+        </w:rPr>
+        <w:t xml:space="preserve"> ou um representante autorizado da </w:t>
+      </w:r>
+      <w:proofErr w:type="spellStart"/>
+      <w:r>
+        <w:rPr>
+          <w:rFonts w:cs="Arial"/>
+          <w:szCs w:val="24"/>
+          <w:highlight w:val="yellow"/>
+        </w:rPr>
+        <w:t>gestoon</w:t>
+      </w:r>
+      <w:proofErr w:type="spellEnd"/>
+      <w:r>
+        <w:rPr>
+          <w:rFonts w:cs="Arial"/>
+          <w:szCs w:val="24"/>
+          <w:highlight w:val="yellow"/>
+        </w:rPr>
+        <w:t xml:space="preserve"> tenha sido notificado oralmente ou por escrito da possibilidade de tais danos. Como algumas jurisdições não permitem limitações em garantias implícitas, ou limitações de responsabilidade por danos </w:t>
+      </w:r>
+      <w:proofErr w:type="spellStart"/>
+      <w:r>
+        <w:rPr>
+          <w:rFonts w:cs="Arial"/>
+          <w:szCs w:val="24"/>
+          <w:highlight w:val="yellow"/>
+        </w:rPr>
+        <w:t>conseqüentes</w:t>
+      </w:r>
+      <w:proofErr w:type="spellEnd"/>
+      <w:r>
+        <w:rPr>
+          <w:rFonts w:cs="Arial"/>
+          <w:szCs w:val="24"/>
+          <w:highlight w:val="yellow"/>
+        </w:rPr>
+        <w:t xml:space="preserve"> ou incidentais, essas limitações podem não se aplicar a você.5. Precisão dos </w:t>
+      </w:r>
+      <w:proofErr w:type="spellStart"/>
+      <w:r>
+        <w:rPr>
+          <w:rFonts w:cs="Arial"/>
+          <w:szCs w:val="24"/>
+          <w:highlight w:val="yellow"/>
+        </w:rPr>
+        <w:t>materiaisOs</w:t>
+      </w:r>
+      <w:proofErr w:type="spellEnd"/>
+      <w:r>
+        <w:rPr>
+          <w:rFonts w:cs="Arial"/>
+          <w:szCs w:val="24"/>
+          <w:highlight w:val="yellow"/>
+        </w:rPr>
+        <w:t xml:space="preserve"> materiais exibidos no site da </w:t>
+      </w:r>
+      <w:proofErr w:type="spellStart"/>
+      <w:r>
+        <w:rPr>
+          <w:rFonts w:cs="Arial"/>
+          <w:szCs w:val="24"/>
+          <w:highlight w:val="yellow"/>
+        </w:rPr>
+        <w:t>gestoon</w:t>
+      </w:r>
+      <w:proofErr w:type="spellEnd"/>
+      <w:r>
+        <w:rPr>
+          <w:rFonts w:cs="Arial"/>
+          <w:szCs w:val="24"/>
+          <w:highlight w:val="yellow"/>
+        </w:rPr>
+        <w:t xml:space="preserve"> podem incluir erros técnicos, tipográficos ou fotográficos. </w:t>
+      </w:r>
+      <w:proofErr w:type="spellStart"/>
+      <w:r>
+        <w:rPr>
+          <w:rFonts w:cs="Arial"/>
+          <w:szCs w:val="24"/>
+          <w:highlight w:val="yellow"/>
+        </w:rPr>
+        <w:t>gestoon</w:t>
+      </w:r>
+      <w:proofErr w:type="spellEnd"/>
+      <w:r>
+        <w:rPr>
+          <w:rFonts w:cs="Arial"/>
+          <w:szCs w:val="24"/>
+          <w:highlight w:val="yellow"/>
+        </w:rPr>
+        <w:t xml:space="preserve"> não garante que qualquer material em seu site seja preciso, completo ou atual. </w:t>
+      </w:r>
+      <w:proofErr w:type="spellStart"/>
+      <w:r>
+        <w:rPr>
+          <w:rFonts w:cs="Arial"/>
+          <w:szCs w:val="24"/>
+          <w:highlight w:val="yellow"/>
+        </w:rPr>
+        <w:t>gestoon</w:t>
+      </w:r>
+      <w:proofErr w:type="spellEnd"/>
+      <w:r>
+        <w:rPr>
+          <w:rFonts w:cs="Arial"/>
+          <w:szCs w:val="24"/>
+          <w:highlight w:val="yellow"/>
+        </w:rPr>
+        <w:t xml:space="preserve"> pode fazer alterações nos materiais contidos em seu site a qualquer momento, sem aviso prévio. No entanto, </w:t>
+      </w:r>
+      <w:proofErr w:type="spellStart"/>
+      <w:r>
+        <w:rPr>
+          <w:rFonts w:cs="Arial"/>
+          <w:szCs w:val="24"/>
+          <w:highlight w:val="yellow"/>
+        </w:rPr>
+        <w:t>gestoon</w:t>
+      </w:r>
+      <w:proofErr w:type="spellEnd"/>
+      <w:r>
+        <w:rPr>
+          <w:rFonts w:cs="Arial"/>
+          <w:szCs w:val="24"/>
+          <w:highlight w:val="yellow"/>
+        </w:rPr>
+        <w:t xml:space="preserve"> não se compromete a atualizar os materiais.6. </w:t>
+      </w:r>
+      <w:proofErr w:type="spellStart"/>
+      <w:r>
+        <w:rPr>
+          <w:rFonts w:cs="Arial"/>
+          <w:szCs w:val="24"/>
+          <w:highlight w:val="yellow"/>
+        </w:rPr>
+        <w:t>LinksO</w:t>
+      </w:r>
+      <w:proofErr w:type="spellEnd"/>
+      <w:r>
+        <w:rPr>
+          <w:rFonts w:cs="Arial"/>
+          <w:szCs w:val="24"/>
+          <w:highlight w:val="yellow"/>
         </w:rPr>
         <w:t xml:space="preserve"> </w:t>
       </w:r>
-      <w:r>
-        <w:rPr>
-          <w:rFonts w:cs="Arial"/>
-          <w:szCs w:val="24"/>
-        </w:rPr>
-        <w:lastRenderedPageBreak/>
-        <w:t xml:space="preserve">não oferece garantias, expressas ou implícitas, e, por este meio, isenta e nega todas as outras garantias, incluindo, sem limitação, garantias implícitas ou condições de comercialização, adequação a um fim específico ou não violação de propriedade intelectual ou outra violação de </w:t>
-      </w:r>
       <w:proofErr w:type="spellStart"/>
       <w:r>
         <w:rPr>
           <w:rFonts w:cs="Arial"/>
           <w:szCs w:val="24"/>
-        </w:rPr>
-        <w:t>direitos.Além</w:t>
+          <w:highlight w:val="yellow"/>
+        </w:rPr>
+        <w:t>gestoon</w:t>
       </w:r>
       <w:proofErr w:type="spellEnd"/>
       <w:r>
         <w:rPr>
           <w:rFonts w:cs="Arial"/>
           <w:szCs w:val="24"/>
-        </w:rPr>
-        <w:t xml:space="preserve"> disso, o </w:t>
+          <w:highlight w:val="yellow"/>
+        </w:rPr>
+        <w:t xml:space="preserve"> não analisou todos os sites vinculados ao seu site e não é responsável pelo conteúdo de nenhum site vinculado. A inclusão de qualquer link não implica endosso por </w:t>
       </w:r>
       <w:proofErr w:type="spellStart"/>
       <w:r>
         <w:rPr>
           <w:rFonts w:cs="Arial"/>
           <w:szCs w:val="24"/>
+          <w:highlight w:val="yellow"/>
         </w:rPr>
         <w:t>gestoon</w:t>
       </w:r>
@@ -20000,230 +20250,7 @@
         <w:rPr>
           <w:rFonts w:cs="Arial"/>
           <w:szCs w:val="24"/>
-        </w:rPr>
-        <w:t xml:space="preserve"> não garante ou faz qualquer representação relativa à precisão, aos resultados prováveis ​​ou à confiabilidade do uso dos materiais em seu site ou de outra forma relacionado a esses materiais ou em sites vinculados a este site.4. </w:t>
-      </w:r>
-      <w:proofErr w:type="spellStart"/>
-      <w:r>
-        <w:rPr>
-          <w:rFonts w:cs="Arial"/>
-          <w:szCs w:val="24"/>
-        </w:rPr>
-        <w:t>LimitaçõesEm</w:t>
-      </w:r>
-      <w:proofErr w:type="spellEnd"/>
-      <w:r>
-        <w:rPr>
-          <w:rFonts w:cs="Arial"/>
-          <w:szCs w:val="24"/>
-        </w:rPr>
-        <w:t xml:space="preserve"> nenhum caso o </w:t>
-      </w:r>
-      <w:proofErr w:type="spellStart"/>
-      <w:r>
-        <w:rPr>
-          <w:rFonts w:cs="Arial"/>
-          <w:szCs w:val="24"/>
-        </w:rPr>
-        <w:t>gestoon</w:t>
-      </w:r>
-      <w:proofErr w:type="spellEnd"/>
-      <w:r>
-        <w:rPr>
-          <w:rFonts w:cs="Arial"/>
-          <w:szCs w:val="24"/>
-        </w:rPr>
-        <w:t xml:space="preserve"> ou seus fornecedores serão responsáveis ​​por quaisquer danos (incluindo, sem limitação, danos por perda de dados ou lucro ou devido a interrupção dos negócios) decorrentes do uso ou da incapacidade de usar os materiais em </w:t>
-      </w:r>
-      <w:proofErr w:type="spellStart"/>
-      <w:r>
-        <w:rPr>
-          <w:rFonts w:cs="Arial"/>
-          <w:szCs w:val="24"/>
-        </w:rPr>
-        <w:t>gestoon</w:t>
-      </w:r>
-      <w:proofErr w:type="spellEnd"/>
-      <w:r>
-        <w:rPr>
-          <w:rFonts w:cs="Arial"/>
-          <w:szCs w:val="24"/>
-        </w:rPr>
-        <w:t xml:space="preserve">, mesmo que </w:t>
-      </w:r>
-      <w:proofErr w:type="spellStart"/>
-      <w:r>
-        <w:rPr>
-          <w:rFonts w:cs="Arial"/>
-          <w:szCs w:val="24"/>
-        </w:rPr>
-        <w:t>gestoon</w:t>
-      </w:r>
-      <w:proofErr w:type="spellEnd"/>
-      <w:r>
-        <w:rPr>
-          <w:rFonts w:cs="Arial"/>
-          <w:szCs w:val="24"/>
-        </w:rPr>
-        <w:t xml:space="preserve"> ou um representante autorizado da </w:t>
-      </w:r>
-      <w:proofErr w:type="spellStart"/>
-      <w:r>
-        <w:rPr>
-          <w:rFonts w:cs="Arial"/>
-          <w:szCs w:val="24"/>
-        </w:rPr>
-        <w:t>gestoon</w:t>
-      </w:r>
-      <w:proofErr w:type="spellEnd"/>
-      <w:r>
-        <w:rPr>
-          <w:rFonts w:cs="Arial"/>
-          <w:szCs w:val="24"/>
-        </w:rPr>
-        <w:t xml:space="preserve"> tenha sido notificado oralmente ou por escrito da possibilidade de tais danos. Como algumas jurisdições não permitem limitações em garantias implícitas, ou limitações de responsabilidade por danos </w:t>
-      </w:r>
-      <w:proofErr w:type="spellStart"/>
-      <w:r>
-        <w:rPr>
-          <w:rFonts w:cs="Arial"/>
-          <w:szCs w:val="24"/>
-        </w:rPr>
-        <w:t>conseqüentes</w:t>
-      </w:r>
-      <w:proofErr w:type="spellEnd"/>
-      <w:r>
-        <w:rPr>
-          <w:rFonts w:cs="Arial"/>
-          <w:szCs w:val="24"/>
-        </w:rPr>
-        <w:t xml:space="preserve"> ou incidentais, essas limitações podem não se aplicar a você.5. Precisão dos </w:t>
-      </w:r>
-      <w:proofErr w:type="spellStart"/>
-      <w:r>
-        <w:rPr>
-          <w:rFonts w:cs="Arial"/>
-          <w:szCs w:val="24"/>
-        </w:rPr>
-        <w:t>materiaisOs</w:t>
-      </w:r>
-      <w:proofErr w:type="spellEnd"/>
-      <w:r>
-        <w:rPr>
-          <w:rFonts w:cs="Arial"/>
-          <w:szCs w:val="24"/>
-        </w:rPr>
-        <w:t xml:space="preserve"> materiais exibidos no site da </w:t>
-      </w:r>
-      <w:proofErr w:type="spellStart"/>
-      <w:r>
-        <w:rPr>
-          <w:rFonts w:cs="Arial"/>
-          <w:szCs w:val="24"/>
-        </w:rPr>
-        <w:t>gestoon</w:t>
-      </w:r>
-      <w:proofErr w:type="spellEnd"/>
-      <w:r>
-        <w:rPr>
-          <w:rFonts w:cs="Arial"/>
-          <w:szCs w:val="24"/>
-        </w:rPr>
-        <w:t xml:space="preserve"> podem incluir erros técnicos, tipográficos ou fotográficos. </w:t>
-      </w:r>
-      <w:proofErr w:type="spellStart"/>
-      <w:r>
-        <w:rPr>
-          <w:rFonts w:cs="Arial"/>
-          <w:szCs w:val="24"/>
-        </w:rPr>
-        <w:t>gestoon</w:t>
-      </w:r>
-      <w:proofErr w:type="spellEnd"/>
-      <w:r>
-        <w:rPr>
-          <w:rFonts w:cs="Arial"/>
-          <w:szCs w:val="24"/>
-        </w:rPr>
-        <w:t xml:space="preserve"> não garante que qualquer material em seu site seja preciso, completo ou atual. </w:t>
-      </w:r>
-      <w:proofErr w:type="spellStart"/>
-      <w:r>
-        <w:rPr>
-          <w:rFonts w:cs="Arial"/>
-          <w:szCs w:val="24"/>
-        </w:rPr>
-        <w:t>gestoon</w:t>
-      </w:r>
-      <w:proofErr w:type="spellEnd"/>
-      <w:r>
-        <w:rPr>
-          <w:rFonts w:cs="Arial"/>
-          <w:szCs w:val="24"/>
-        </w:rPr>
-        <w:t xml:space="preserve"> pode fazer alterações nos materiais contidos em seu site a qualquer momento, sem aviso prévio. No entanto, </w:t>
-      </w:r>
-      <w:proofErr w:type="spellStart"/>
-      <w:r>
-        <w:rPr>
-          <w:rFonts w:cs="Arial"/>
-          <w:szCs w:val="24"/>
-        </w:rPr>
-        <w:t>gestoon</w:t>
-      </w:r>
-      <w:proofErr w:type="spellEnd"/>
-      <w:r>
-        <w:rPr>
-          <w:rFonts w:cs="Arial"/>
-          <w:szCs w:val="24"/>
-        </w:rPr>
-        <w:t xml:space="preserve"> não se compromete a atualizar os materiais.6. </w:t>
-      </w:r>
-      <w:proofErr w:type="spellStart"/>
-      <w:r>
-        <w:rPr>
-          <w:rFonts w:cs="Arial"/>
-          <w:szCs w:val="24"/>
-        </w:rPr>
-        <w:t>LinksO</w:t>
-      </w:r>
-      <w:proofErr w:type="spellEnd"/>
-      <w:r>
-        <w:rPr>
-          <w:rFonts w:cs="Arial"/>
-          <w:szCs w:val="24"/>
-        </w:rPr>
-        <w:t xml:space="preserve"> </w:t>
-      </w:r>
-      <w:proofErr w:type="spellStart"/>
-      <w:r>
-        <w:rPr>
-          <w:rFonts w:cs="Arial"/>
-          <w:szCs w:val="24"/>
-        </w:rPr>
-        <w:t>gestoon</w:t>
-      </w:r>
-      <w:proofErr w:type="spellEnd"/>
-      <w:r>
-        <w:rPr>
-          <w:rFonts w:cs="Arial"/>
-          <w:szCs w:val="24"/>
-        </w:rPr>
-        <w:t xml:space="preserve"> não analisou todos os sites vinculados ao seu site e não é responsável pelo conteúdo de nenhum site vinculado. A inclusão de qualquer link não implica endosso por </w:t>
-      </w:r>
-      <w:proofErr w:type="spellStart"/>
-      <w:r>
-        <w:rPr>
-          <w:rFonts w:cs="Arial"/>
-          <w:szCs w:val="24"/>
-        </w:rPr>
-        <w:t>gestoon</w:t>
-      </w:r>
-      <w:proofErr w:type="spellEnd"/>
-      <w:r>
-        <w:rPr>
-          <w:rFonts w:cs="Arial"/>
-          <w:szCs w:val="24"/>
+          <w:highlight w:val="yellow"/>
         </w:rPr>
         <w:t xml:space="preserve"> do site. O uso de qualquer site vinculado é por conta e risco do </w:t>
       </w:r>
@@ -20233,6 +20260,7 @@
         <w:rPr>
           <w:rFonts w:cs="Arial"/>
           <w:szCs w:val="24"/>
+          <w:highlight w:val="yellow"/>
         </w:rPr>
         <w:t>usuário.ModificaçõesO</w:t>
       </w:r>
@@ -20242,6 +20270,7 @@
         <w:rPr>
           <w:rFonts w:cs="Arial"/>
           <w:szCs w:val="24"/>
+          <w:highlight w:val="yellow"/>
         </w:rPr>
         <w:t xml:space="preserve"> </w:t>
       </w:r>
@@ -20250,6 +20279,7 @@
         <w:rPr>
           <w:rFonts w:cs="Arial"/>
           <w:szCs w:val="24"/>
+          <w:highlight w:val="yellow"/>
         </w:rPr>
         <w:t>gestoon</w:t>
       </w:r>
@@ -20258,6 +20288,7 @@
         <w:rPr>
           <w:rFonts w:cs="Arial"/>
           <w:szCs w:val="24"/>
+          <w:highlight w:val="yellow"/>
         </w:rPr>
         <w:t xml:space="preserve"> pode revisar estes termos de serviço do site a qualquer momento, sem aviso prévio. Ao usar este site, você concorda em ficar vinculado à versão atual desses termos de </w:t>
       </w:r>
@@ -20267,6 +20298,7 @@
         <w:rPr>
           <w:rFonts w:cs="Arial"/>
           <w:szCs w:val="24"/>
+          <w:highlight w:val="yellow"/>
         </w:rPr>
         <w:t>serviço.Lei</w:t>
       </w:r>
@@ -20276,6 +20308,7 @@
         <w:rPr>
           <w:rFonts w:cs="Arial"/>
           <w:szCs w:val="24"/>
+          <w:highlight w:val="yellow"/>
         </w:rPr>
         <w:t xml:space="preserve"> </w:t>
       </w:r>
@@ -20284,6 +20317,7 @@
         <w:rPr>
           <w:rFonts w:cs="Arial"/>
           <w:szCs w:val="24"/>
+          <w:highlight w:val="yellow"/>
         </w:rPr>
         <w:t>aplicávelEstes</w:t>
       </w:r>
@@ -20292,14 +20326,25 @@
         <w:rPr>
           <w:rFonts w:cs="Arial"/>
           <w:szCs w:val="24"/>
-        </w:rPr>
-        <w:t xml:space="preserve"> termos e condições são regidos e interpretados de acordo com as leis do </w:t>
+          <w:highlight w:val="yellow"/>
+        </w:rPr>
+        <w:t xml:space="preserve"> termos e condições são regidos e interpretados de acordo </w:t>
+      </w:r>
+      <w:r>
+        <w:rPr>
+          <w:rFonts w:cs="Arial"/>
+          <w:szCs w:val="24"/>
+          <w:highlight w:val="yellow"/>
+        </w:rPr>
+        <w:lastRenderedPageBreak/>
+        <w:t xml:space="preserve">com as leis do </w:t>
       </w:r>
       <w:proofErr w:type="spellStart"/>
       <w:r>
         <w:rPr>
           <w:rFonts w:cs="Arial"/>
           <w:szCs w:val="24"/>
+          <w:highlight w:val="yellow"/>
         </w:rPr>
         <w:t>gestoon</w:t>
       </w:r>
@@ -20308,6 +20353,7 @@
         <w:rPr>
           <w:rFonts w:cs="Arial"/>
           <w:szCs w:val="24"/>
+          <w:highlight w:val="yellow"/>
         </w:rPr>
         <w:t xml:space="preserve"> e você se submete irrevogavelmente à jurisdição exclusiva dos tribunais naquele estado ou localidade.</w:t>
       </w:r>
@@ -20342,6 +20388,7 @@
           <w:rFonts w:cs="Arial"/>
           <w:b/>
           <w:szCs w:val="24"/>
+          <w:highlight w:val="yellow"/>
         </w:rPr>
       </w:pPr>
       <w:bookmarkStart w:id="27" w:name="_Toc193385952"/>
@@ -20350,6 +20397,7 @@
           <w:rFonts w:cs="Arial"/>
           <w:b/>
           <w:szCs w:val="24"/>
+          <w:highlight w:val="yellow"/>
         </w:rPr>
         <w:lastRenderedPageBreak/>
         <w:t>CONSIDERAÇÕES FINAIS</w:t>
@@ -20361,12 +20409,14 @@
         <w:rPr>
           <w:rFonts w:cs="Arial"/>
           <w:szCs w:val="24"/>
-        </w:rPr>
-      </w:pPr>
-      <w:r>
-        <w:rPr>
-          <w:rFonts w:cs="Arial"/>
-          <w:szCs w:val="24"/>
+          <w:highlight w:val="yellow"/>
+        </w:rPr>
+      </w:pPr>
+      <w:r>
+        <w:rPr>
+          <w:rFonts w:cs="Arial"/>
+          <w:szCs w:val="24"/>
+          <w:highlight w:val="yellow"/>
         </w:rPr>
         <w:t>Parte final do trabalho no qual são expostas as conclusões correspondentes aos objetivos e hipóteses, apresentados na introdução.</w:t>
       </w:r>
@@ -20376,12 +20426,14 @@
         <w:rPr>
           <w:rFonts w:cs="Arial"/>
           <w:szCs w:val="24"/>
-        </w:rPr>
-      </w:pPr>
-      <w:r>
-        <w:rPr>
-          <w:rFonts w:cs="Arial"/>
-          <w:szCs w:val="24"/>
+          <w:highlight w:val="yellow"/>
+        </w:rPr>
+      </w:pPr>
+      <w:r>
+        <w:rPr>
+          <w:rFonts w:cs="Arial"/>
+          <w:szCs w:val="24"/>
+          <w:highlight w:val="yellow"/>
         </w:rPr>
         <w:t>Nesse campo são apontadas as respostas às hipóteses e objetivos do TCC. O ponto de vista dos autores, devidamente embasado p</w:t>
       </w:r>
@@ -20389,6 +20441,7 @@
         <w:rPr>
           <w:rFonts w:cs="Arial"/>
           <w:szCs w:val="24"/>
+          <w:highlight w:val="yellow"/>
         </w:rPr>
         <w:t xml:space="preserve"> </w:t>
       </w:r>
@@ -20396,6 +20449,7 @@
         <w:rPr>
           <w:rFonts w:cs="Arial"/>
           <w:szCs w:val="24"/>
+          <w:highlight w:val="yellow"/>
         </w:rPr>
         <w:t>elos dados, conceitos e informações apresentados no desenvolvimento deve ser inserido aqui. Podem ser incluídas breves recomendações e sugestões para trabalhos futuros.</w:t>
       </w:r>
@@ -20405,22 +20459,25 @@
         <w:rPr>
           <w:rFonts w:cs="Arial"/>
           <w:szCs w:val="24"/>
-        </w:rPr>
-      </w:pPr>
-    </w:p>
-    <w:p>
-      <w:pPr>
-        <w:rPr>
-          <w:rFonts w:cs="Arial"/>
-          <w:szCs w:val="24"/>
-        </w:rPr>
-      </w:pPr>
-    </w:p>
-    <w:p>
-      <w:pPr>
-        <w:rPr>
-          <w:rFonts w:cs="Arial"/>
-          <w:szCs w:val="24"/>
+          <w:highlight w:val="yellow"/>
+        </w:rPr>
+      </w:pPr>
+    </w:p>
+    <w:p>
+      <w:pPr>
+        <w:rPr>
+          <w:rFonts w:cs="Arial"/>
+          <w:szCs w:val="24"/>
+          <w:highlight w:val="yellow"/>
+        </w:rPr>
+      </w:pPr>
+    </w:p>
+    <w:p>
+      <w:pPr>
+        <w:rPr>
+          <w:rFonts w:cs="Arial"/>
+          <w:szCs w:val="24"/>
+          <w:highlight w:val="yellow"/>
         </w:rPr>
       </w:pPr>
     </w:p>
@@ -20431,12 +20488,14 @@
         <w:rPr>
           <w:rFonts w:cs="Arial"/>
           <w:szCs w:val="24"/>
-        </w:rPr>
-      </w:pPr>
-      <w:r>
-        <w:rPr>
-          <w:rFonts w:cs="Arial"/>
-          <w:szCs w:val="24"/>
+          <w:highlight w:val="yellow"/>
+        </w:rPr>
+      </w:pPr>
+      <w:r>
+        <w:rPr>
+          <w:rFonts w:cs="Arial"/>
+          <w:szCs w:val="24"/>
+          <w:highlight w:val="yellow"/>
         </w:rPr>
         <w:br w:type="page"/>
       </w:r>
@@ -20449,6 +20508,7 @@
           <w:rFonts w:cs="Arial"/>
           <w:b/>
           <w:szCs w:val="24"/>
+          <w:highlight w:val="yellow"/>
         </w:rPr>
       </w:pPr>
       <w:bookmarkStart w:id="28" w:name="_Toc193385953"/>
@@ -20457,6 +20517,7 @@
           <w:rFonts w:cs="Arial"/>
           <w:b/>
           <w:szCs w:val="24"/>
+          <w:highlight w:val="yellow"/>
         </w:rPr>
         <w:lastRenderedPageBreak/>
         <w:t>REFERÊNCIAS</w:t>
@@ -20470,6 +20531,7 @@
           <w:rFonts w:cs="Arial"/>
           <w:sz w:val="20"/>
           <w:szCs w:val="20"/>
+          <w:highlight w:val="yellow"/>
         </w:rPr>
       </w:pPr>
       <w:r>
@@ -20477,6 +20539,7 @@
           <w:rFonts w:cs="Arial"/>
           <w:sz w:val="20"/>
           <w:szCs w:val="20"/>
+          <w:highlight w:val="yellow"/>
         </w:rPr>
         <w:t xml:space="preserve">BALLOU, Ronald H. </w:t>
       </w:r>
@@ -20486,6 +20549,7 @@
           <w:rFonts w:cs="Arial"/>
           <w:sz w:val="20"/>
           <w:szCs w:val="20"/>
+          <w:highlight w:val="yellow"/>
         </w:rPr>
         <w:t>Gerenciamento da cadeia de suprimentos: logística empresarial</w:t>
       </w:r>
@@ -20494,6 +20558,7 @@
           <w:rFonts w:cs="Arial"/>
           <w:sz w:val="20"/>
           <w:szCs w:val="20"/>
+          <w:highlight w:val="yellow"/>
         </w:rPr>
         <w:t>. Porto Alegre: Bookman, 2006.</w:t>
       </w:r>
@@ -20505,6 +20570,7 @@
           <w:rFonts w:cs="Arial"/>
           <w:sz w:val="20"/>
           <w:szCs w:val="20"/>
+          <w:highlight w:val="yellow"/>
         </w:rPr>
       </w:pPr>
       <w:r>
@@ -20512,6 +20578,7 @@
           <w:rFonts w:cs="Arial"/>
           <w:sz w:val="20"/>
           <w:szCs w:val="20"/>
+          <w:highlight w:val="yellow"/>
         </w:rPr>
         <w:t xml:space="preserve">LAUDON, Kenneth C.; LAUDON, Jane P. </w:t>
       </w:r>
@@ -20521,6 +20588,7 @@
           <w:rFonts w:cs="Arial"/>
           <w:sz w:val="20"/>
           <w:szCs w:val="20"/>
+          <w:highlight w:val="yellow"/>
         </w:rPr>
         <w:t>Sistemas de informação gerenciais</w:t>
       </w:r>
@@ -20529,6 +20597,7 @@
           <w:rFonts w:cs="Arial"/>
           <w:sz w:val="20"/>
           <w:szCs w:val="20"/>
+          <w:highlight w:val="yellow"/>
         </w:rPr>
         <w:t>. 11. ed. São Paulo: Pearson, 2014.</w:t>
       </w:r>
@@ -20540,6 +20609,7 @@
           <w:rFonts w:cs="Arial"/>
           <w:sz w:val="20"/>
           <w:szCs w:val="20"/>
+          <w:highlight w:val="yellow"/>
         </w:rPr>
       </w:pPr>
       <w:r>
@@ -20547,6 +20617,7 @@
           <w:rFonts w:cs="Arial"/>
           <w:sz w:val="20"/>
           <w:szCs w:val="20"/>
+          <w:highlight w:val="yellow"/>
         </w:rPr>
         <w:t xml:space="preserve">O’BRIEN, James A.; MARAKAS, George M. </w:t>
       </w:r>
@@ -20556,6 +20627,7 @@
           <w:rFonts w:cs="Arial"/>
           <w:sz w:val="20"/>
           <w:szCs w:val="20"/>
+          <w:highlight w:val="yellow"/>
         </w:rPr>
         <w:t>Sistemas de informação gerenciais</w:t>
       </w:r>
@@ -20564,6 +20636,7 @@
           <w:rFonts w:cs="Arial"/>
           <w:sz w:val="20"/>
           <w:szCs w:val="20"/>
+          <w:highlight w:val="yellow"/>
         </w:rPr>
         <w:t>. Porto Alegre: AMGH, 2013.</w:t>
       </w:r>
@@ -20575,6 +20648,7 @@
           <w:rFonts w:cs="Arial"/>
           <w:sz w:val="20"/>
           <w:szCs w:val="20"/>
+          <w:highlight w:val="yellow"/>
         </w:rPr>
       </w:pPr>
       <w:r>
@@ -20582,6 +20656,7 @@
           <w:rFonts w:cs="Arial"/>
           <w:sz w:val="20"/>
           <w:szCs w:val="20"/>
+          <w:highlight w:val="yellow"/>
         </w:rPr>
         <w:t xml:space="preserve">PRESSMAN, Roger S. </w:t>
       </w:r>
@@ -20591,6 +20666,7 @@
           <w:rFonts w:cs="Arial"/>
           <w:sz w:val="20"/>
           <w:szCs w:val="20"/>
+          <w:highlight w:val="yellow"/>
         </w:rPr>
         <w:t>Engenharia de software: uma abordagem profissional</w:t>
       </w:r>
@@ -20599,6 +20675,7 @@
           <w:rFonts w:cs="Arial"/>
           <w:sz w:val="20"/>
           <w:szCs w:val="20"/>
+          <w:highlight w:val="yellow"/>
         </w:rPr>
         <w:t>. 8. ed. Porto Alegre: AMGH, 2016.</w:t>
       </w:r>
@@ -20610,6 +20687,7 @@
           <w:rFonts w:cs="Arial"/>
           <w:sz w:val="20"/>
           <w:szCs w:val="20"/>
+          <w:highlight w:val="yellow"/>
         </w:rPr>
       </w:pPr>
       <w:r>
@@ -20617,6 +20695,7 @@
           <w:rFonts w:cs="Arial"/>
           <w:sz w:val="20"/>
           <w:szCs w:val="20"/>
+          <w:highlight w:val="yellow"/>
         </w:rPr>
         <w:t xml:space="preserve">SLACK, Nigel; CHAMBERS, Stuart; JOHNSTON, Robert. </w:t>
       </w:r>
@@ -20626,6 +20705,7 @@
           <w:rFonts w:cs="Arial"/>
           <w:sz w:val="20"/>
           <w:szCs w:val="20"/>
+          <w:highlight w:val="yellow"/>
         </w:rPr>
         <w:t>Administração da produção</w:t>
       </w:r>
@@ -20634,6 +20714,7 @@
           <w:rFonts w:cs="Arial"/>
           <w:sz w:val="20"/>
           <w:szCs w:val="20"/>
+          <w:highlight w:val="yellow"/>
         </w:rPr>
         <w:t>. São Paulo: Atlas, 2009.</w:t>
       </w:r>
@@ -20645,6 +20726,7 @@
           <w:rFonts w:cs="Arial"/>
           <w:sz w:val="20"/>
           <w:szCs w:val="20"/>
+          <w:highlight w:val="yellow"/>
         </w:rPr>
       </w:pPr>
       <w:r>
@@ -20652,6 +20734,7 @@
           <w:rFonts w:cs="Arial"/>
           <w:sz w:val="20"/>
           <w:szCs w:val="20"/>
+          <w:highlight w:val="yellow"/>
         </w:rPr>
         <w:t xml:space="preserve">TURBAN, Efraim et al. </w:t>
       </w:r>
@@ -20661,6 +20744,7 @@
           <w:rFonts w:cs="Arial"/>
           <w:sz w:val="20"/>
           <w:szCs w:val="20"/>
+          <w:highlight w:val="yellow"/>
         </w:rPr>
         <w:t>Tecnologia da informação para gestão</w:t>
       </w:r>
@@ -20669,6 +20753,7 @@
           <w:rFonts w:cs="Arial"/>
           <w:sz w:val="20"/>
           <w:szCs w:val="20"/>
+          <w:highlight w:val="yellow"/>
         </w:rPr>
         <w:t>. Porto Alegre: Bookman, 2013.</w:t>
       </w:r>
@@ -20688,6 +20773,7 @@
           <w:rFonts w:cs="Arial"/>
           <w:sz w:val="20"/>
           <w:szCs w:val="20"/>
+          <w:highlight w:val="yellow"/>
         </w:rPr>
         <w:t>CONFEDERAÇÃO NACIONAL DE DIRIGENTES Lojistas (CNDL). Automação no varejo e organização de processos. 2024.</w:t>
       </w:r>
@@ -23243,6 +23329,10 @@
 </file>
 
 <file path=customXml/item1.xml><?xml version="1.0" encoding="utf-8"?>
+<b:Sources xmlns:b="http://schemas.openxmlformats.org/officeDocument/2006/bibliography" xmlns="http://schemas.openxmlformats.org/officeDocument/2006/bibliography" SelectedStyle="\APA.XSL" StyleName="APA"/>
+</file>
+
+<file path=customXml/item2.xml><?xml version="1.0" encoding="utf-8"?>
 <ct:contentTypeSchema xmlns:ct="http://schemas.microsoft.com/office/2006/metadata/contentType" xmlns:ma="http://schemas.microsoft.com/office/2006/metadata/properties/metaAttributes" ct:_="" ma:_="" ma:contentTypeName="Documento" ma:contentTypeID="0x01010079E85AF13E1D6948BAEBBC3E299C7A4C" ma:contentTypeVersion="11" ma:contentTypeDescription="Crie um novo documento." ma:contentTypeScope="" ma:versionID="9903338d6f6ebf8d9f52e57d695b90e0">
   <xsd:schema xmlns:xsd="http://www.w3.org/2001/XMLSchema" xmlns:xs="http://www.w3.org/2001/XMLSchema" xmlns:p="http://schemas.microsoft.com/office/2006/metadata/properties" xmlns:ns2="1c99b82c-450d-407b-8685-188b0222f857" xmlns:ns3="ec9326a9-796b-4177-81ae-8ce46d6874ce" targetNamespace="http://schemas.microsoft.com/office/2006/metadata/properties" ma:root="true" ma:fieldsID="27025b9af28ab54196939bbeabbec0a9" ns2:_="" ns3:_="">
     <xsd:import namespace="1c99b82c-450d-407b-8685-188b0222f857"/>
@@ -23431,10 +23521,6 @@
 </ct:contentTypeSchema>
 </file>
 
-<file path=customXml/item2.xml><?xml version="1.0" encoding="utf-8"?>
-<b:Sources xmlns:b="http://schemas.openxmlformats.org/officeDocument/2006/bibliography" xmlns="http://schemas.openxmlformats.org/officeDocument/2006/bibliography" SelectedStyle="\APA.XSL" StyleName="APA"/>
-</file>
-
 <file path=customXml/item3.xml><?xml version="1.0" encoding="utf-8"?>
 <?mso-contentType ?>
 <FormTemplates xmlns="http://schemas.microsoft.com/sharepoint/v3/contenttype/forms">
@@ -23445,6 +23531,14 @@
 </file>
 
 <file path=customXml/itemProps1.xml><?xml version="1.0" encoding="utf-8"?>
+<ds:datastoreItem xmlns:ds="http://schemas.openxmlformats.org/officeDocument/2006/customXml" ds:itemID="{6D1FBB9A-856D-43D0-A2C9-AA3DEE8D1533}">
+  <ds:schemaRefs>
+    <ds:schemaRef ds:uri="http://schemas.openxmlformats.org/officeDocument/2006/bibliography"/>
+  </ds:schemaRefs>
+</ds:datastoreItem>
+</file>
+
+<file path=customXml/itemProps2.xml><?xml version="1.0" encoding="utf-8"?>
 <ds:datastoreItem xmlns:ds="http://schemas.openxmlformats.org/officeDocument/2006/customXml" ds:itemID="{F9562963-6458-4B09-8DDA-F09296948AA7}">
   <ds:schemaRefs>
     <ds:schemaRef ds:uri="http://schemas.microsoft.com/office/2006/metadata/contentType"/>
@@ -23463,14 +23557,6 @@
 </ds:datastoreItem>
 </file>
 
-<file path=customXml/itemProps2.xml><?xml version="1.0" encoding="utf-8"?>
-<ds:datastoreItem xmlns:ds="http://schemas.openxmlformats.org/officeDocument/2006/customXml" ds:itemID="{6D1FBB9A-856D-43D0-A2C9-AA3DEE8D1533}">
-  <ds:schemaRefs>
-    <ds:schemaRef ds:uri="http://schemas.openxmlformats.org/officeDocument/2006/bibliography"/>
-  </ds:schemaRefs>
-</ds:datastoreItem>
-</file>
-
 <file path=customXml/itemProps3.xml><?xml version="1.0" encoding="utf-8"?>
 <ds:datastoreItem xmlns:ds="http://schemas.openxmlformats.org/officeDocument/2006/customXml" ds:itemID="{19856E04-179F-401F-8246-BA08537D6152}">
   <ds:schemaRefs>

</xml_diff>